<commit_message>
Update second-pass report date
</commit_message>
<xml_diff>
--- a/report/计算机设计实践最终实验报告-黄宇轩-第二次修改版.docx
+++ b/report/计算机设计实践最终实验报告-黄宇轩-第二次修改版.docx
@@ -304,7 +304,7 @@
                 <w:color w:val="000000"/>
                 <w:sz w:val="20"/>
               </w:rPr>
-              <w:t>2026年6月17日</w:t>
+              <w:t>2026 年 6 月 20 日</w:t>
             </w:r>
           </w:p>
         </w:tc>
@@ -2453,42 +2453,8 @@
             <w:r>
               <w:rPr>
                 <w:noProof/>
+                <w:color w:val="000000"/>
               </w:rPr>
-              <w:drawing>
-                <wp:inline distT="0" distB="0" distL="0" distR="0" wp14:anchorId="6B74FF5C" wp14:editId="027560DD">
-                  <wp:extent cx="2606040" cy="3445273"/>
-                  <wp:effectExtent l="0" t="0" r="0" b="0"/>
-                  <wp:docPr id="11" name="Picture 11"/>
-                  <wp:cNvGraphicFramePr>
-                    <a:graphicFrameLocks xmlns:a="http://schemas.openxmlformats.org/drawingml/2006/main" noChangeAspect="1"/>
-                  </wp:cNvGraphicFramePr>
-                  <a:graphic xmlns:a="http://schemas.openxmlformats.org/drawingml/2006/main">
-                    <a:graphicData uri="http://schemas.openxmlformats.org/drawingml/2006/picture">
-                      <pic:pic xmlns:pic="http://schemas.openxmlformats.org/drawingml/2006/picture">
-                        <pic:nvPicPr>
-                          <pic:cNvPr id="0" name="board_original_02181173.png"/>
-                          <pic:cNvPicPr/>
-                        </pic:nvPicPr>
-                        <pic:blipFill>
-                          <a:blip r:embed="rId18"/>
-                          <a:stretch>
-                            <a:fillRect/>
-                          </a:stretch>
-                        </pic:blipFill>
-                        <pic:spPr>
-                          <a:xfrm>
-                            <a:off x="0" y="0"/>
-                            <a:ext cx="2606040" cy="3445273"/>
-                          </a:xfrm>
-                          <a:prstGeom prst="rect">
-                            <a:avLst/>
-                          </a:prstGeom>
-                        </pic:spPr>
-                      </pic:pic>
-                    </a:graphicData>
-                  </a:graphic>
-                </wp:inline>
-              </w:drawing>
             </w:r>
           </w:p>
         </w:tc>
@@ -2509,42 +2475,8 @@
             <w:r>
               <w:rPr>
                 <w:noProof/>
+                <w:color w:val="000000"/>
               </w:rPr>
-              <w:drawing>
-                <wp:inline distT="0" distB="0" distL="0" distR="0" wp14:anchorId="6C11BC40" wp14:editId="7F6FC568">
-                  <wp:extent cx="2606040" cy="3419822"/>
-                  <wp:effectExtent l="0" t="0" r="0" b="0"/>
-                  <wp:docPr id="12" name="Picture 12"/>
-                  <wp:cNvGraphicFramePr>
-                    <a:graphicFrameLocks xmlns:a="http://schemas.openxmlformats.org/drawingml/2006/main" noChangeAspect="1"/>
-                  </wp:cNvGraphicFramePr>
-                  <a:graphic xmlns:a="http://schemas.openxmlformats.org/drawingml/2006/main">
-                    <a:graphicData uri="http://schemas.openxmlformats.org/drawingml/2006/picture">
-                      <pic:pic xmlns:pic="http://schemas.openxmlformats.org/drawingml/2006/picture">
-                        <pic:nvPicPr>
-                          <pic:cNvPr id="0" name="board_sorted_result.png"/>
-                          <pic:cNvPicPr/>
-                        </pic:nvPicPr>
-                        <pic:blipFill>
-                          <a:blip r:embed="rId19"/>
-                          <a:stretch>
-                            <a:fillRect/>
-                          </a:stretch>
-                        </pic:blipFill>
-                        <pic:spPr>
-                          <a:xfrm>
-                            <a:off x="0" y="0"/>
-                            <a:ext cx="2606040" cy="3419822"/>
-                          </a:xfrm>
-                          <a:prstGeom prst="rect">
-                            <a:avLst/>
-                          </a:prstGeom>
-                        </pic:spPr>
-                      </pic:pic>
-                    </a:graphicData>
-                  </a:graphic>
-                </wp:inline>
-              </w:drawing>
             </w:r>
           </w:p>
         </w:tc>

</xml_diff>